<commit_message>
Remove space after log date
</commit_message>
<xml_diff>
--- a/arches_her/docx/Pre-app Predetermination letter.docx
+++ b/arches_her/docx/Pre-app Predetermination letter.docx
@@ -535,7 +535,7 @@
         <w:rPr>
           <w:rFonts w:cstheme="minorHAnsi"/>
         </w:rPr>
-        <w:t xml:space="preserve">Thank you for your consultation received on &lt;Log Date||%Y-%m-%d||%d %B %Y &gt;.  </w:t>
+        <w:t xml:space="preserve">Thank you for your consultation received on &lt;Log Date||%Y-%m-%d||%d %B %Y&gt;.  </w:t>
       </w:r>
     </w:p>
     <w:p>
@@ -833,57 +833,29 @@
         <w:rPr>
           <w:rFonts w:cstheme="minorHAnsi"/>
         </w:rPr>
-        <w:t xml:space="preserve">This letter concludes GLAAS’ free Initial Pre-application advice (that is, one free cycle of advice and engagement).  Further information on archaeology and planning in Greater London is available on the Historic England website.  If further pre-application advice (other than minor clarifications) is </w:t>
-      </w:r>
-      <w:proofErr w:type="gramStart"/>
-      <w:r>
-        <w:rPr>
-          <w:rFonts w:cstheme="minorHAnsi"/>
-        </w:rPr>
-        <w:t>requested</w:t>
-      </w:r>
-      <w:proofErr w:type="gramEnd"/>
-      <w:r>
-        <w:rPr>
-          <w:rFonts w:cstheme="minorHAnsi"/>
-        </w:rPr>
-        <w:t xml:space="preserve"> then you will be asked to use our Extended Pre-application service which provides applicants with a bespoke programme of advice and engagement beyond the initial free cycle. We charge for this extended service on a cost-recovery basis; we do not make a profit from it.</w:t>
-      </w:r>
-    </w:p>
-    <w:p>
-      <w:pPr>
-        <w:spacing w:after="0" w:line="240" w:lineRule="auto"/>
-        <w:rPr>
-          <w:rFonts w:cstheme="minorHAnsi"/>
-        </w:rPr>
-      </w:pPr>
-    </w:p>
-    <w:p>
-      <w:pPr>
-        <w:spacing w:after="0" w:line="240" w:lineRule="auto"/>
-        <w:rPr>
-          <w:rFonts w:cstheme="minorHAnsi"/>
-        </w:rPr>
-      </w:pPr>
-      <w:r>
-        <w:rPr>
-          <w:rFonts w:cstheme="minorHAnsi"/>
-        </w:rPr>
-        <w:t xml:space="preserve">This Initial Pre-application advice relates solely to archaeological considerations, is provided without prejudice to the local authority’s decision-making </w:t>
-      </w:r>
-      <w:proofErr w:type="gramStart"/>
-      <w:r>
-        <w:rPr>
-          <w:rFonts w:cstheme="minorHAnsi"/>
-        </w:rPr>
-        <w:t>role, and</w:t>
-      </w:r>
-      <w:proofErr w:type="gramEnd"/>
-      <w:r>
-        <w:rPr>
-          <w:rFonts w:cstheme="minorHAnsi"/>
-        </w:rPr>
-        <w:t xml:space="preserve"> may be shared with the local authority on whose behalf it is given.  You should also consult Historic England’s Development Management team on statutory matters.</w:t>
+        <w:t>This letter concludes GLAAS’ free Initial Pre-application advice (that is, one free cycle of advice and engagement).  Further information on archaeology and planning in Greater London is available on the Historic England website.  If further pre-application advice (other than minor clarifications) is requested then you will be asked to use our Extended Pre-application service which provides applicants with a bespoke programme of advice and engagement beyond the initial free cycle. We charge for this extended service on a cost-recovery basis; we do not make a profit from it.</w:t>
+      </w:r>
+    </w:p>
+    <w:p>
+      <w:pPr>
+        <w:spacing w:after="0" w:line="240" w:lineRule="auto"/>
+        <w:rPr>
+          <w:rFonts w:cstheme="minorHAnsi"/>
+        </w:rPr>
+      </w:pPr>
+    </w:p>
+    <w:p>
+      <w:pPr>
+        <w:spacing w:after="0" w:line="240" w:lineRule="auto"/>
+        <w:rPr>
+          <w:rFonts w:cstheme="minorHAnsi"/>
+        </w:rPr>
+      </w:pPr>
+      <w:r>
+        <w:rPr>
+          <w:rFonts w:cstheme="minorHAnsi"/>
+        </w:rPr>
+        <w:t>This Initial Pre-application advice relates solely to archaeological considerations, is provided without prejudice to the local authority’s decision-making role, and may be shared with the local authority on whose behalf it is given.  You should also consult Historic England’s Development Management team on statutory matters.</w:t>
       </w:r>
     </w:p>
     <w:p>
@@ -1004,21 +976,7 @@
         <w:rPr>
           <w:rFonts w:cstheme="minorHAnsi"/>
         </w:rPr>
-        <w:t xml:space="preserve">London and </w:t>
-      </w:r>
-      <w:proofErr w:type="gramStart"/>
-      <w:r>
-        <w:rPr>
-          <w:rFonts w:cstheme="minorHAnsi"/>
-        </w:rPr>
-        <w:t>South East</w:t>
-      </w:r>
-      <w:proofErr w:type="gramEnd"/>
-      <w:r>
-        <w:rPr>
-          <w:rFonts w:cstheme="minorHAnsi"/>
-        </w:rPr>
-        <w:t xml:space="preserve"> Region</w:t>
+        <w:t>London and South East Region</w:t>
       </w:r>
     </w:p>
     <w:p>
@@ -1286,9 +1244,8 @@
         <w:sz w:val="16"/>
         <w:szCs w:val="16"/>
       </w:rPr>
-      <w:t xml:space="preserve">Historic England, 4th Floor, Cannon Bridge House, 25 </w:t>
+      <w:t>Historic England, 4th Floor, Cannon Bridge House, 25 Dowgate Hill, London EC4R 2YA</w:t>
     </w:r>
-    <w:proofErr w:type="spellStart"/>
     <w:r>
       <w:rPr>
         <w:rFonts w:ascii="Arial" w:hAnsi="Arial"/>
@@ -1297,27 +1254,6 @@
         <w:sz w:val="16"/>
         <w:szCs w:val="16"/>
       </w:rPr>
-      <w:t>Dowgate</w:t>
-    </w:r>
-    <w:proofErr w:type="spellEnd"/>
-    <w:r>
-      <w:rPr>
-        <w:rFonts w:ascii="Arial" w:hAnsi="Arial"/>
-        <w:b/>
-        <w:bCs/>
-        <w:sz w:val="16"/>
-        <w:szCs w:val="16"/>
-      </w:rPr>
-      <w:t xml:space="preserve"> Hill, London EC4R 2YA</w:t>
-    </w:r>
-    <w:r>
-      <w:rPr>
-        <w:rFonts w:ascii="Arial" w:hAnsi="Arial"/>
-        <w:b/>
-        <w:bCs/>
-        <w:sz w:val="16"/>
-        <w:szCs w:val="16"/>
-      </w:rPr>
       <w:br/>
     </w:r>
     <w:r>
@@ -1334,16 +1270,15 @@
         <w:sz w:val="16"/>
         <w:szCs w:val="16"/>
       </w:rPr>
-      <w:t xml:space="preserve">020 7973 </w:t>
+      <w:t>020 7973 3700</w:t>
     </w:r>
-    <w:proofErr w:type="gramStart"/>
     <w:r>
       <w:rPr>
         <w:rFonts w:ascii="Arial" w:hAnsi="Arial"/>
         <w:sz w:val="16"/>
         <w:szCs w:val="16"/>
       </w:rPr>
-      <w:t>3700</w:t>
+      <w:t xml:space="preserve">  </w:t>
     </w:r>
     <w:r>
       <w:rPr>
@@ -1351,24 +1286,7 @@
         <w:sz w:val="16"/>
         <w:szCs w:val="16"/>
       </w:rPr>
-      <w:t xml:space="preserve">  </w:t>
-    </w:r>
-    <w:r>
-      <w:rPr>
-        <w:rFonts w:ascii="Arial" w:hAnsi="Arial"/>
-        <w:sz w:val="16"/>
-        <w:szCs w:val="16"/>
-      </w:rPr>
-      <w:t>|</w:t>
-    </w:r>
-    <w:proofErr w:type="gramEnd"/>
-    <w:r>
-      <w:rPr>
-        <w:rFonts w:ascii="Arial" w:hAnsi="Arial"/>
-        <w:sz w:val="16"/>
-        <w:szCs w:val="16"/>
-      </w:rPr>
-      <w:t xml:space="preserve">  </w:t>
+      <w:t xml:space="preserve">|  </w:t>
     </w:r>
     <w:r>
       <w:rPr>
@@ -3096,21 +3014,6 @@
 </file>
 
 <file path=customXml/item1.xml><?xml version="1.0" encoding="utf-8"?>
-<p:properties xmlns:p="http://schemas.microsoft.com/office/2006/metadata/properties" xmlns:xsi="http://www.w3.org/2001/XMLSchema-instance" xmlns:pc="http://schemas.microsoft.com/office/infopath/2007/PartnerControls">
-  <documentManagement>
-    <lcf76f155ced4ddcb4097134ff3c332f xmlns="e789b7fa-a83c-4c6b-9e01-87c723f67228">
-      <Terms xmlns="http://schemas.microsoft.com/office/infopath/2007/PartnerControls"/>
-    </lcf76f155ced4ddcb4097134ff3c332f>
-    <TaxCatchAll xmlns="bb952b06-3268-4e55-b0fe-9eb49669fc08" xsi:nil="true"/>
-  </documentManagement>
-</p:properties>
-</file>
-
-<file path=customXml/item2.xml><?xml version="1.0" encoding="utf-8"?>
-<b:Sources xmlns:b="http://schemas.openxmlformats.org/officeDocument/2006/bibliography" xmlns="http://schemas.openxmlformats.org/officeDocument/2006/bibliography" SelectedStyle="/APASixthEditionOfficeOnline.xsl" StyleName="APA" Version="6"/>
-</file>
-
-<file path=customXml/item3.xml><?xml version="1.0" encoding="utf-8"?>
 <ct:contentTypeSchema xmlns:ct="http://schemas.microsoft.com/office/2006/metadata/contentType" xmlns:ma="http://schemas.microsoft.com/office/2006/metadata/properties/metaAttributes" ct:_="" ma:_="" ma:contentTypeName="Document" ma:contentTypeID="0x010100B89331DE8EA64F4FBEA00113BF0E4514" ma:contentTypeVersion="11" ma:contentTypeDescription="Create a new document." ma:contentTypeScope="" ma:versionID="0b60b04e60edb8b2e7e2fe1cc7d413e0">
   <xsd:schema xmlns:xsd="http://www.w3.org/2001/XMLSchema" xmlns:xs="http://www.w3.org/2001/XMLSchema" xmlns:p="http://schemas.microsoft.com/office/2006/metadata/properties" xmlns:ns2="e789b7fa-a83c-4c6b-9e01-87c723f67228" xmlns:ns3="bb952b06-3268-4e55-b0fe-9eb49669fc08" targetNamespace="http://schemas.microsoft.com/office/2006/metadata/properties" ma:root="true" ma:fieldsID="52467e30880403e5f73a15b97b0992c8" ns2:_="" ns3:_="">
     <xsd:import namespace="e789b7fa-a83c-4c6b-9e01-87c723f67228"/>
@@ -3305,6 +3208,21 @@
 </ct:contentTypeSchema>
 </file>
 
+<file path=customXml/item2.xml><?xml version="1.0" encoding="utf-8"?>
+<b:Sources xmlns:b="http://schemas.openxmlformats.org/officeDocument/2006/bibliography" xmlns="http://schemas.openxmlformats.org/officeDocument/2006/bibliography" SelectedStyle="/APASixthEditionOfficeOnline.xsl" StyleName="APA" Version="6"/>
+</file>
+
+<file path=customXml/item3.xml><?xml version="1.0" encoding="utf-8"?>
+<p:properties xmlns:p="http://schemas.microsoft.com/office/2006/metadata/properties" xmlns:xsi="http://www.w3.org/2001/XMLSchema-instance" xmlns:pc="http://schemas.microsoft.com/office/infopath/2007/PartnerControls">
+  <documentManagement>
+    <lcf76f155ced4ddcb4097134ff3c332f xmlns="e789b7fa-a83c-4c6b-9e01-87c723f67228">
+      <Terms xmlns="http://schemas.microsoft.com/office/infopath/2007/PartnerControls"/>
+    </lcf76f155ced4ddcb4097134ff3c332f>
+    <TaxCatchAll xmlns="bb952b06-3268-4e55-b0fe-9eb49669fc08" xsi:nil="true"/>
+  </documentManagement>
+</p:properties>
+</file>
+
 <file path=customXml/item4.xml><?xml version="1.0" encoding="utf-8"?>
 <?mso-contentType ?>
 <FormTemplates xmlns="http://schemas.microsoft.com/sharepoint/v3/contenttype/forms">
@@ -3315,25 +3233,6 @@
 </file>
 
 <file path=customXml/itemProps1.xml><?xml version="1.0" encoding="utf-8"?>
-<ds:datastoreItem xmlns:ds="http://schemas.openxmlformats.org/officeDocument/2006/customXml" ds:itemID="{EF43FDED-CD1D-4301-B761-71C1DCC851CC}">
-  <ds:schemaRefs>
-    <ds:schemaRef ds:uri="http://schemas.microsoft.com/office/2006/metadata/properties"/>
-    <ds:schemaRef ds:uri="http://schemas.microsoft.com/office/infopath/2007/PartnerControls"/>
-    <ds:schemaRef ds:uri="e789b7fa-a83c-4c6b-9e01-87c723f67228"/>
-    <ds:schemaRef ds:uri="bb952b06-3268-4e55-b0fe-9eb49669fc08"/>
-  </ds:schemaRefs>
-</ds:datastoreItem>
-</file>
-
-<file path=customXml/itemProps2.xml><?xml version="1.0" encoding="utf-8"?>
-<ds:datastoreItem xmlns:ds="http://schemas.openxmlformats.org/officeDocument/2006/customXml" ds:itemID="{3B4892E8-18D6-D444-BA6E-299F0B60384F}">
-  <ds:schemaRefs>
-    <ds:schemaRef ds:uri="http://schemas.openxmlformats.org/officeDocument/2006/bibliography"/>
-  </ds:schemaRefs>
-</ds:datastoreItem>
-</file>
-
-<file path=customXml/itemProps3.xml><?xml version="1.0" encoding="utf-8"?>
 <ds:datastoreItem xmlns:ds="http://schemas.openxmlformats.org/officeDocument/2006/customXml" ds:itemID="{93F00A47-6514-4C46-91C6-8D2331E8318E}">
   <ds:schemaRefs>
     <ds:schemaRef ds:uri="http://schemas.microsoft.com/office/2006/metadata/contentType"/>
@@ -3352,6 +3251,25 @@
 </ds:datastoreItem>
 </file>
 
+<file path=customXml/itemProps2.xml><?xml version="1.0" encoding="utf-8"?>
+<ds:datastoreItem xmlns:ds="http://schemas.openxmlformats.org/officeDocument/2006/customXml" ds:itemID="{3B4892E8-18D6-D444-BA6E-299F0B60384F}">
+  <ds:schemaRefs>
+    <ds:schemaRef ds:uri="http://schemas.openxmlformats.org/officeDocument/2006/bibliography"/>
+  </ds:schemaRefs>
+</ds:datastoreItem>
+</file>
+
+<file path=customXml/itemProps3.xml><?xml version="1.0" encoding="utf-8"?>
+<ds:datastoreItem xmlns:ds="http://schemas.openxmlformats.org/officeDocument/2006/customXml" ds:itemID="{EF43FDED-CD1D-4301-B761-71C1DCC851CC}">
+  <ds:schemaRefs>
+    <ds:schemaRef ds:uri="http://schemas.microsoft.com/office/2006/metadata/properties"/>
+    <ds:schemaRef ds:uri="http://schemas.microsoft.com/office/infopath/2007/PartnerControls"/>
+    <ds:schemaRef ds:uri="e789b7fa-a83c-4c6b-9e01-87c723f67228"/>
+    <ds:schemaRef ds:uri="bb952b06-3268-4e55-b0fe-9eb49669fc08"/>
+  </ds:schemaRefs>
+</ds:datastoreItem>
+</file>
+
 <file path=customXml/itemProps4.xml><?xml version="1.0" encoding="utf-8"?>
 <ds:datastoreItem xmlns:ds="http://schemas.openxmlformats.org/officeDocument/2006/customXml" ds:itemID="{45FB1F57-968F-4A6E-AEE9-65961EB5FADD}">
   <ds:schemaRefs>

</xml_diff>